<commit_message>
Polish the lab chrome, study rooms, downloads, and guide.
Replace the utility strip and jump menu with a top-left sliding drawer, one banner row, and a phone bar. Box the disclaimer, limit identity links to the lab set, and expand diagrams, flows, games, and standalone downloads. The guide is a compact CSS monkey with choice cards and optional browser speech.

Co-authored-by: CYPHER0X9 <cipher0x9@users.noreply.github.com>
</commit_message>
<xml_diff>
--- a/downloads/ba-templates.docx
+++ b/downloads/ba-templates.docx
@@ -406,11 +406,22 @@
     </w:p>
     <w:p>
       <w:r>
-        <w:t>Independent, free, learning-only student project. Respects every company, tradition, and vendor. Trademarks and sources belong to their owners. Not sold. Concerns are handled by correcting or removing content promptly via https://cyphermonkeylabs.com/#contact. Happy to volunteer for any organization.</w:t>
+        <w:t>Independent, free, learning-only student project. Respects every company and vendor. Trademarks belong to their owners. Not affiliated or endorsed. Concerns are removed or corrected promptly via the contact form at https://cyphermonkeylabs.com/#contact. Nothing is sold. Happy to volunteer for any organization.</w:t>
       </w:r>
     </w:p>
     <w:p>
       <w:hyperlink r:id="rId9">
+        <w:r>
+          <w:rPr>
+            <w:color w:val="1D4ED8"/>
+          </w:rPr>
+          <w:t>Website</w:t>
+        </w:r>
+      </w:hyperlink>
+      <w:r>
+        <w:t xml:space="preserve">   </w:t>
+      </w:r>
+      <w:hyperlink r:id="rId10">
         <w:r>
           <w:rPr>
             <w:color w:val="1D4ED8"/>
@@ -421,18 +432,18 @@
       <w:r>
         <w:t xml:space="preserve">   </w:t>
       </w:r>
-      <w:hyperlink r:id="rId10">
+      <w:hyperlink r:id="rId11">
         <w:r>
           <w:rPr>
             <w:color w:val="1D4ED8"/>
           </w:rPr>
-          <w:t>Website</w:t>
+          <w:t>Profile</w:t>
         </w:r>
       </w:hyperlink>
       <w:r>
         <w:t xml:space="preserve">   </w:t>
       </w:r>
-      <w:hyperlink r:id="rId11">
+      <w:hyperlink r:id="rId12">
         <w:r>
           <w:rPr>
             <w:color w:val="1D4ED8"/>
@@ -443,7 +454,7 @@
       <w:r>
         <w:t xml:space="preserve">   </w:t>
       </w:r>
-      <w:hyperlink r:id="rId12">
+      <w:hyperlink r:id="rId13">
         <w:r>
           <w:rPr>
             <w:color w:val="1D4ED8"/>
@@ -454,7 +465,7 @@
       <w:r>
         <w:t xml:space="preserve">   </w:t>
       </w:r>
-      <w:hyperlink r:id="rId13">
+      <w:hyperlink r:id="rId14">
         <w:r>
           <w:rPr>
             <w:color w:val="1D4ED8"/>
@@ -462,9 +473,20 @@
           <w:t>Hugging Face</w:t>
         </w:r>
       </w:hyperlink>
+      <w:r>
+        <w:t xml:space="preserve">   </w:t>
+      </w:r>
+      <w:hyperlink r:id="rId15">
+        <w:r>
+          <w:rPr>
+            <w:color w:val="1D4ED8"/>
+          </w:rPr>
+          <w:t>Contact</w:t>
+        </w:r>
+      </w:hyperlink>
     </w:p>
     <w:sectPr>
-      <w:footerReference w:type="default" r:id="rId14"/>
+      <w:footerReference w:type="default" r:id="rId16"/>
       <w:pgSz w:w="12240" w:h="15840"/>
       <w:pgMar w:top="1440" w:right="1800" w:bottom="1440" w:left="1800" w:header="720" w:footer="720" w:gutter="0"/>
       <w:cols w:space="720"/>
@@ -481,11 +503,22 @@
       <w:pStyle w:val="Footer"/>
     </w:pPr>
     <w:r>
-      <w:t>CypherMonkey Labs · © 2026 CypherMonkeyLabs · Independent, free, learning-only student project. Respects every company, tradition, and vendor. Trademarks and sources belong to their owners. Not sold. Concerns are handled by co</w:t>
+      <w:t>CypherMonkey Labs · © 2026 CypherMonkeyLabs · Independent, free, learning-only student project. Respects every company and vendor. Trademarks belong to their owners. Not affiliated or endorsed. Concerns are removed or correcte</w:t>
     </w:r>
   </w:p>
   <w:p>
     <w:hyperlink r:id="rId1">
+      <w:r>
+        <w:rPr>
+          <w:color w:val="1D4ED8"/>
+        </w:rPr>
+        <w:t>Website</w:t>
+      </w:r>
+    </w:hyperlink>
+    <w:r>
+      <w:t xml:space="preserve">  </w:t>
+    </w:r>
+    <w:hyperlink r:id="rId2">
       <w:r>
         <w:rPr>
           <w:color w:val="1D4ED8"/>
@@ -496,18 +529,18 @@
     <w:r>
       <w:t xml:space="preserve">  </w:t>
     </w:r>
-    <w:hyperlink r:id="rId2">
+    <w:hyperlink r:id="rId3">
       <w:r>
         <w:rPr>
           <w:color w:val="1D4ED8"/>
         </w:rPr>
-        <w:t>Website</w:t>
+        <w:t>Profile</w:t>
       </w:r>
     </w:hyperlink>
     <w:r>
       <w:t xml:space="preserve">  </w:t>
     </w:r>
-    <w:hyperlink r:id="rId3">
+    <w:hyperlink r:id="rId4">
       <w:r>
         <w:rPr>
           <w:color w:val="1D4ED8"/>
@@ -518,7 +551,7 @@
     <w:r>
       <w:t xml:space="preserve">  </w:t>
     </w:r>
-    <w:hyperlink r:id="rId4">
+    <w:hyperlink r:id="rId5">
       <w:r>
         <w:rPr>
           <w:color w:val="1D4ED8"/>
@@ -529,12 +562,23 @@
     <w:r>
       <w:t xml:space="preserve">  </w:t>
     </w:r>
-    <w:hyperlink r:id="rId5">
+    <w:hyperlink r:id="rId6">
       <w:r>
         <w:rPr>
           <w:color w:val="1D4ED8"/>
         </w:rPr>
         <w:t>Hugging Face</w:t>
+      </w:r>
+    </w:hyperlink>
+    <w:r>
+      <w:t xml:space="preserve">  </w:t>
+    </w:r>
+    <w:hyperlink r:id="rId7">
+      <w:r>
+        <w:rPr>
+          <w:color w:val="1D4ED8"/>
+        </w:rPr>
+        <w:t>Contact</w:t>
       </w:r>
     </w:hyperlink>
   </w:p>

</xml_diff>

<commit_message>
Add the tour, read-along guide, room exports, and legal page.
Keep only the three brand links, dock the guide on the right edge, and ship an installable web app with prepared publishing notes.

Co-authored-by: CYPHER0X9 <cipher0x9@users.noreply.github.com>
</commit_message>
<xml_diff>
--- a/downloads/ba-templates.docx
+++ b/downloads/ba-templates.docx
@@ -440,53 +440,9 @@
           <w:t>Profile</w:t>
         </w:r>
       </w:hyperlink>
-      <w:r>
-        <w:t xml:space="preserve">   </w:t>
-      </w:r>
-      <w:hyperlink r:id="rId12">
-        <w:r>
-          <w:rPr>
-            <w:color w:val="1D4ED8"/>
-          </w:rPr>
-          <w:t>X</w:t>
-        </w:r>
-      </w:hyperlink>
-      <w:r>
-        <w:t xml:space="preserve">   </w:t>
-      </w:r>
-      <w:hyperlink r:id="rId13">
-        <w:r>
-          <w:rPr>
-            <w:color w:val="1D4ED8"/>
-          </w:rPr>
-          <w:t>LinkedIn</w:t>
-        </w:r>
-      </w:hyperlink>
-      <w:r>
-        <w:t xml:space="preserve">   </w:t>
-      </w:r>
-      <w:hyperlink r:id="rId14">
-        <w:r>
-          <w:rPr>
-            <w:color w:val="1D4ED8"/>
-          </w:rPr>
-          <w:t>Hugging Face</w:t>
-        </w:r>
-      </w:hyperlink>
-      <w:r>
-        <w:t xml:space="preserve">   </w:t>
-      </w:r>
-      <w:hyperlink r:id="rId15">
-        <w:r>
-          <w:rPr>
-            <w:color w:val="1D4ED8"/>
-          </w:rPr>
-          <w:t>Contact</w:t>
-        </w:r>
-      </w:hyperlink>
     </w:p>
     <w:sectPr>
-      <w:footerReference w:type="default" r:id="rId16"/>
+      <w:footerReference w:type="default" r:id="rId12"/>
       <w:pgSz w:w="12240" w:h="15840"/>
       <w:pgMar w:top="1440" w:right="1800" w:bottom="1440" w:left="1800" w:header="720" w:footer="720" w:gutter="0"/>
       <w:cols w:space="720"/>
@@ -535,50 +491,6 @@
           <w:color w:val="1D4ED8"/>
         </w:rPr>
         <w:t>Profile</w:t>
-      </w:r>
-    </w:hyperlink>
-    <w:r>
-      <w:t xml:space="preserve">  </w:t>
-    </w:r>
-    <w:hyperlink r:id="rId4">
-      <w:r>
-        <w:rPr>
-          <w:color w:val="1D4ED8"/>
-        </w:rPr>
-        <w:t>X</w:t>
-      </w:r>
-    </w:hyperlink>
-    <w:r>
-      <w:t xml:space="preserve">  </w:t>
-    </w:r>
-    <w:hyperlink r:id="rId5">
-      <w:r>
-        <w:rPr>
-          <w:color w:val="1D4ED8"/>
-        </w:rPr>
-        <w:t>LinkedIn</w:t>
-      </w:r>
-    </w:hyperlink>
-    <w:r>
-      <w:t xml:space="preserve">  </w:t>
-    </w:r>
-    <w:hyperlink r:id="rId6">
-      <w:r>
-        <w:rPr>
-          <w:color w:val="1D4ED8"/>
-        </w:rPr>
-        <w:t>Hugging Face</w:t>
-      </w:r>
-    </w:hyperlink>
-    <w:r>
-      <w:t xml:space="preserve">  </w:t>
-    </w:r>
-    <w:hyperlink r:id="rId7">
-      <w:r>
-        <w:rPr>
-          <w:color w:val="1D4ED8"/>
-        </w:rPr>
-        <w:t>Contact</w:t>
       </w:r>
     </w:hyperlink>
   </w:p>

</xml_diff>

<commit_message>
End every room and download with opened sources.
Each sheet, card, chapter, and room export closes with Sources and go deeper. Per-room sources.json is rendered on the page. A link that did not open is marked confirm and is not given a URL.

Co-authored-by: CYPHER0X9 <cipher0x9@users.noreply.github.com>
</commit_message>
<xml_diff>
--- a/downloads/ba-templates.docx
+++ b/downloads/ba-templates.docx
@@ -441,8 +441,309 @@
         </w:r>
       </w:hyperlink>
     </w:p>
+    <w:p>
+      <w:pPr>
+        <w:pStyle w:val="Heading1"/>
+      </w:pPr>
+      <w:r>
+        <w:t>Sources and go deeper</w:t>
+      </w:r>
+    </w:p>
+    <w:p>
+      <w:r>
+        <w:t>Last checked 2026-10. A line marked confirm did not open, so it is not linked.</w:t>
+      </w:r>
+    </w:p>
+    <w:p>
+      <w:pPr>
+        <w:pStyle w:val="ListBullet"/>
+      </w:pPr>
+      <w:hyperlink r:id="rId12">
+        <w:r>
+          <w:rPr>
+            <w:color w:val="1D4ED8"/>
+          </w:rPr>
+          <w:t>IIBA KnowledgeHub, including the BABOK Guide contents</w:t>
+        </w:r>
+      </w:hyperlink>
+      <w:r>
+        <w:t xml:space="preserve"> (standard, last checked 2026-10)</w:t>
+      </w:r>
+    </w:p>
+    <w:p>
+      <w:pPr>
+        <w:pStyle w:val="ListBullet"/>
+      </w:pPr>
+      <w:r>
+        <w:t>BABOK Guide article on the IIBA knowledge hub (standard, confirm, last checked 2026-10)</w:t>
+      </w:r>
+    </w:p>
+    <w:p>
+      <w:pPr>
+        <w:pStyle w:val="ListBullet"/>
+      </w:pPr>
+      <w:hyperlink r:id="rId13">
+        <w:r>
+          <w:rPr>
+            <w:color w:val="1D4ED8"/>
+          </w:rPr>
+          <w:t>IIBA home</w:t>
+        </w:r>
+      </w:hyperlink>
+      <w:r>
+        <w:t xml:space="preserve"> (official, last checked 2026-10)</w:t>
+      </w:r>
+    </w:p>
+    <w:p>
+      <w:pPr>
+        <w:pStyle w:val="ListBullet"/>
+      </w:pPr>
+      <w:hyperlink r:id="rId14">
+        <w:r>
+          <w:rPr>
+            <w:color w:val="1D4ED8"/>
+          </w:rPr>
+          <w:t>Manifesto for Agile Software Development</w:t>
+        </w:r>
+      </w:hyperlink>
+      <w:r>
+        <w:t xml:space="preserve"> (standard, last checked 2026-10)</w:t>
+      </w:r>
+    </w:p>
+    <w:p>
+      <w:pPr>
+        <w:pStyle w:val="ListBullet"/>
+      </w:pPr>
+      <w:hyperlink r:id="rId15">
+        <w:r>
+          <w:rPr>
+            <w:color w:val="1D4ED8"/>
+          </w:rPr>
+          <w:t>Principles behind the Agile Manifesto</w:t>
+        </w:r>
+      </w:hyperlink>
+      <w:r>
+        <w:t xml:space="preserve"> (standard, last checked 2026-10)</w:t>
+      </w:r>
+    </w:p>
+    <w:p>
+      <w:pPr>
+        <w:pStyle w:val="ListBullet"/>
+      </w:pPr>
+      <w:hyperlink r:id="rId16">
+        <w:r>
+          <w:rPr>
+            <w:color w:val="1D4ED8"/>
+          </w:rPr>
+          <w:t>OMG, about BPMN 2.0</w:t>
+        </w:r>
+      </w:hyperlink>
+      <w:r>
+        <w:t xml:space="preserve"> (standard, last checked 2026-10)</w:t>
+      </w:r>
+    </w:p>
+    <w:p>
+      <w:pPr>
+        <w:pStyle w:val="ListBullet"/>
+      </w:pPr>
+      <w:hyperlink r:id="rId17">
+        <w:r>
+          <w:rPr>
+            <w:color w:val="1D4ED8"/>
+          </w:rPr>
+          <w:t>BPMN 2.0 specification PDF</w:t>
+        </w:r>
+      </w:hyperlink>
+      <w:r>
+        <w:t xml:space="preserve"> (standard, last checked 2026-10)</w:t>
+      </w:r>
+    </w:p>
+    <w:p>
+      <w:pPr>
+        <w:pStyle w:val="ListBullet"/>
+      </w:pPr>
+      <w:hyperlink r:id="rId18">
+        <w:r>
+          <w:rPr>
+            <w:color w:val="1D4ED8"/>
+          </w:rPr>
+          <w:t>OMG, about BPMN 2.0.2</w:t>
+        </w:r>
+      </w:hyperlink>
+      <w:r>
+        <w:t xml:space="preserve"> (standard, last checked 2026-10)</w:t>
+      </w:r>
+    </w:p>
+    <w:p>
+      <w:pPr>
+        <w:pStyle w:val="ListBullet"/>
+      </w:pPr>
+      <w:hyperlink r:id="rId19">
+        <w:r>
+          <w:rPr>
+            <w:color w:val="1D4ED8"/>
+          </w:rPr>
+          <w:t>OMG, about UML 2.5.1</w:t>
+        </w:r>
+      </w:hyperlink>
+      <w:r>
+        <w:t xml:space="preserve"> (standard, last checked 2026-10)</w:t>
+      </w:r>
+    </w:p>
+    <w:p>
+      <w:pPr>
+        <w:pStyle w:val="ListBullet"/>
+      </w:pPr>
+      <w:hyperlink r:id="rId20">
+        <w:r>
+          <w:rPr>
+            <w:color w:val="1D4ED8"/>
+          </w:rPr>
+          <w:t>UML 2.5.1 specification PDF</w:t>
+        </w:r>
+      </w:hyperlink>
+      <w:r>
+        <w:t xml:space="preserve"> (standard, last checked 2026-10)</w:t>
+      </w:r>
+    </w:p>
+    <w:p>
+      <w:pPr>
+        <w:pStyle w:val="ListBullet"/>
+      </w:pPr>
+      <w:hyperlink r:id="rId21">
+        <w:r>
+          <w:rPr>
+            <w:color w:val="1D4ED8"/>
+          </w:rPr>
+          <w:t>IIBA membership</w:t>
+        </w:r>
+      </w:hyperlink>
+      <w:r>
+        <w:t xml:space="preserve"> (community, last checked 2026-10)</w:t>
+      </w:r>
+    </w:p>
+    <w:p>
+      <w:pPr>
+        <w:pStyle w:val="ListBullet"/>
+      </w:pPr>
+      <w:hyperlink r:id="rId22">
+        <w:r>
+          <w:rPr>
+            <w:color w:val="1D4ED8"/>
+          </w:rPr>
+          <w:t>OMG managed communities</w:t>
+        </w:r>
+      </w:hyperlink>
+      <w:r>
+        <w:t xml:space="preserve"> (community, last checked 2026-10)</w:t>
+      </w:r>
+    </w:p>
+    <w:p>
+      <w:pPr>
+        <w:pStyle w:val="ListBullet"/>
+      </w:pPr>
+      <w:hyperlink r:id="rId23">
+        <w:r>
+          <w:rPr>
+            <w:color w:val="1D4ED8"/>
+          </w:rPr>
+          <w:t>Atlassian, user stories</w:t>
+        </w:r>
+      </w:hyperlink>
+      <w:r>
+        <w:t xml:space="preserve"> (official, last checked 2026-10)</w:t>
+      </w:r>
+    </w:p>
+    <w:p>
+      <w:pPr>
+        <w:pStyle w:val="ListBullet"/>
+      </w:pPr>
+      <w:hyperlink r:id="rId24">
+        <w:r>
+          <w:rPr>
+            <w:color w:val="1D4ED8"/>
+          </w:rPr>
+          <w:t>Gherkin reference</w:t>
+        </w:r>
+      </w:hyperlink>
+      <w:r>
+        <w:t xml:space="preserve"> (official, last checked 2026-10)</w:t>
+      </w:r>
+    </w:p>
+    <w:p>
+      <w:pPr>
+        <w:pStyle w:val="ListBullet"/>
+      </w:pPr>
+      <w:hyperlink r:id="rId25">
+        <w:r>
+          <w:rPr>
+            <w:color w:val="1D4ED8"/>
+          </w:rPr>
+          <w:t>Gherkin</w:t>
+        </w:r>
+      </w:hyperlink>
+      <w:r>
+        <w:t xml:space="preserve"> (official, last checked 2026-10)</w:t>
+      </w:r>
+    </w:p>
+    <w:p>
+      <w:pPr>
+        <w:pStyle w:val="ListBullet"/>
+      </w:pPr>
+      <w:hyperlink r:id="rId26">
+        <w:r>
+          <w:rPr>
+            <w:color w:val="1D4ED8"/>
+          </w:rPr>
+          <w:t>Atlassian Agile</w:t>
+        </w:r>
+      </w:hyperlink>
+      <w:r>
+        <w:t xml:space="preserve"> (official, last checked 2026-10)</w:t>
+      </w:r>
+    </w:p>
+    <w:p>
+      <w:pPr>
+        <w:pStyle w:val="ListBullet"/>
+      </w:pPr>
+      <w:hyperlink r:id="rId27">
+        <w:r>
+          <w:rPr>
+            <w:color w:val="1D4ED8"/>
+          </w:rPr>
+          <w:t>Atlassian Community</w:t>
+        </w:r>
+      </w:hyperlink>
+      <w:r>
+        <w:t xml:space="preserve"> (community, last checked 2026-10)</w:t>
+      </w:r>
+    </w:p>
+    <w:p>
+      <w:pPr>
+        <w:pStyle w:val="ListBullet"/>
+      </w:pPr>
+      <w:r>
+        <w:t>ISO/IEC/IEEE 29148 (standard, confirm, last checked 2026-10)</w:t>
+      </w:r>
+    </w:p>
+    <w:p>
+      <w:pPr>
+        <w:pStyle w:val="ListBullet"/>
+      </w:pPr>
+      <w:hyperlink r:id="rId28">
+        <w:r>
+          <w:rPr>
+            <w:color w:val="1D4ED8"/>
+          </w:rPr>
+          <w:t>Software requirements specification</w:t>
+        </w:r>
+      </w:hyperlink>
+      <w:r>
+        <w:t xml:space="preserve"> (wikipedia, last checked 2026-10)</w:t>
+      </w:r>
+    </w:p>
     <w:sectPr>
-      <w:footerReference w:type="default" r:id="rId12"/>
+      <w:footerReference w:type="default" r:id="rId29"/>
       <w:pgSz w:w="12240" w:h="15840"/>
       <w:pgMar w:top="1440" w:right="1800" w:bottom="1440" w:left="1800" w:header="720" w:footer="720" w:gutter="0"/>
       <w:cols w:space="720"/>

</xml_diff>

<commit_message>
Add contact-center journey, metric, and migration rooms.
The Learn menu now opens omnichannel journeys, contact-center metrics, and cloud-migration artifacts, and the ecosystem room adds a glossary, mind map, sister technologies, and integration sequence. Formulas and artifacts are taken from pages opened in October 2026. The catalog now counts 169 notes, 75 diagrams, 36 flows, and 54 cards.

Co-authored-by: CYPHER0X9 <cipher0x9@users.noreply.github.com>
</commit_message>
<xml_diff>
--- a/downloads/ba-templates.docx
+++ b/downloads/ba-templates.docx
@@ -406,7 +406,7 @@
     </w:p>
     <w:p>
       <w:r>
-        <w:t>Independent, free, learning-only student project. Respects every company and vendor. Trademarks belong to their owners. Not affiliated or endorsed. Concerns are removed or corrected promptly via the contact form at https://cyphermonkeylabs.com/#contact. Nothing is sold. Happy to volunteer for any organization.</w:t>
+        <w:t>Independent, free, learning-only student project. Respects every company and vendor. Trademarks belong to their owners. Not affiliated or endorsed. Names in the contact-center rooms are citations of pages opened in October 2026, not endorsements. Concerns are removed or corrected promptly via the contact form at https://cyphermonkeylabs.com/#contact. Nothing is sold. Happy to volunteer for any organization.</w:t>
       </w:r>
     </w:p>
     <w:p>
@@ -760,7 +760,7 @@
       <w:pStyle w:val="Footer"/>
     </w:pPr>
     <w:r>
-      <w:t>CypherMonkey Labs · © 2026 CypherMonkeyLabs · Independent, free, learning-only student project. Respects every company and vendor. Trademarks belong to their owners. Not affiliated or endorsed. Concerns are removed or correcte</w:t>
+      <w:t>CypherMonkey Labs · © 2026 CypherMonkeyLabs · Independent, free, learning-only student project. Respects every company and vendor. Trademarks belong to their owners. Not affiliated or endorsed. Names in the contact-center room</w:t>
     </w:r>
   </w:p>
   <w:p>

</xml_diff>

<commit_message>
Add contact-center journey, metric, and migration rooms. (#4)
The Learn menu now opens omnichannel journeys, contact-center metrics, and cloud-migration artifacts, and the ecosystem room adds a glossary, mind map, sister technologies, and integration sequence. Formulas and artifacts are taken from pages opened in October 2026. The catalog now counts 169 notes, 75 diagrams, 36 flows, and 54 cards.

Co-authored-by: Cursor Agent <cursoragent@cursor.com>
Co-authored-by: CYPHER0X9 <cipher0x9@users.noreply.github.com>
</commit_message>
<xml_diff>
--- a/downloads/ba-templates.docx
+++ b/downloads/ba-templates.docx
@@ -406,7 +406,7 @@
     </w:p>
     <w:p>
       <w:r>
-        <w:t>Independent, free, learning-only student project. Respects every company and vendor. Trademarks belong to their owners. Not affiliated or endorsed. Concerns are removed or corrected promptly via the contact form at https://cyphermonkeylabs.com/#contact. Nothing is sold. Happy to volunteer for any organization.</w:t>
+        <w:t>Independent, free, learning-only student project. Respects every company and vendor. Trademarks belong to their owners. Not affiliated or endorsed. Names in the contact-center rooms are citations of pages opened in October 2026, not endorsements. Concerns are removed or corrected promptly via the contact form at https://cyphermonkeylabs.com/#contact. Nothing is sold. Happy to volunteer for any organization.</w:t>
       </w:r>
     </w:p>
     <w:p>
@@ -760,7 +760,7 @@
       <w:pStyle w:val="Footer"/>
     </w:pPr>
     <w:r>
-      <w:t>CypherMonkey Labs · © 2026 CypherMonkeyLabs · Independent, free, learning-only student project. Respects every company and vendor. Trademarks belong to their owners. Not affiliated or endorsed. Concerns are removed or correcte</w:t>
+      <w:t>CypherMonkey Labs · © 2026 CypherMonkeyLabs · Independent, free, learning-only student project. Respects every company and vendor. Trademarks belong to their owners. Not affiliated or endorsed. Names in the contact-center room</w:t>
     </w:r>
   </w:p>
   <w:p>

</xml_diff>